<commit_message>
Correct Operations/Finance role split in managers briefing
- Operations Manager now owns costing & allocation (Part 3, orange)
- Finance Manager section corrected to cover job time reporting, AP/AR,
  monthly finance reports, and job time system recommendation (Part 4, green)
- Replaced infographic-M3-finance with M3-operations (Operations mandate)
- Added infographic-M4-finance (Finance mandate — corrected scope)
- Regenerated Managers-Briefing-2026.docx with both corrected sections

Co-Authored-By: Claude Sonnet 4.6 <noreply@anthropic.com>
Claude-Session: https://claude.ai/code/session_01FujGE9vvBG8EQRodGbb5XZ
</commit_message>
<xml_diff>
--- a/Managers-Briefing-2026.docx
+++ b/Managers-Briefing-2026.docx
@@ -2339,7 +2339,7 @@
           <w:color w:val="FFFFFF"/>
           <w:sz w:val="40"/>
         </w:rPr>
-        <w:t>PART THREE — FINANCE</w:t>
+        <w:t>PART THREE — OPERATIONS</w:t>
       </w:r>
     </w:p>
     <w:p>
@@ -2353,7 +2353,7 @@
           <w:color w:val="CCD6E8"/>
           <w:sz w:val="22"/>
         </w:rPr>
-        <w:t>Finance Manager</w:t>
+        <w:t>Operations Manager</w:t>
       </w:r>
     </w:p>
     <w:p>
@@ -2392,7 +2392,7 @@
           <w:color w:val="404040"/>
           <w:sz w:val="20"/>
         </w:rPr>
-        <w:t>Finance sits downstream in the value stream — but upstream of the decisions that determine whether throughput targets are met. When costing is slow, allocation decisions are made on incomplete information. When allocation decisions are wrong, production plans break down. When production plans break down, pressure builds — and pressure drives errors.</w:t>
+        <w:t>Operations owns costing and allocation — the step that converts a completed build into a closed job and a correct invoice. When this is slow, the consequences run in two directions: cash flow delays upstream and production plan failures downstream. Every job that sits in the costing queue is a job not yet closed, not yet invoiced, and not yet informing the next allocation decision.</w:t>
       </w:r>
     </w:p>
     <w:p>
@@ -2406,7 +2406,7 @@
           <w:color w:val="404040"/>
           <w:sz w:val="20"/>
         </w:rPr>
-        <w:t>The costing and allocation process is a constraint on throughput. You are not the root cause of the cascade — engineering is. But your turnaround speed is a lever that, when improved, releases capacity across the whole operation.</w:t>
+        <w:t>The costing and allocation process is a real constraint on throughput. Engineering is the root cause of the cascade — but Operations is where the pressure of late engineering is most visibly felt, and where the fix must be most operationally practical.</w:t>
       </w:r>
     </w:p>
     <w:p>
@@ -2421,7 +2421,7 @@
           <w:color w:val="1F3964"/>
           <w:sz w:val="20"/>
         </w:rPr>
-        <w:t>The target is clear: costing turnaround reduced 40% within 6 months.</w:t>
+        <w:t>The target: costing turnaround reduced 40% within 6 months.</w:t>
       </w:r>
     </w:p>
     <w:p>
@@ -2445,7 +2445,7 @@
         <w:rPr>
           <w:b/>
           <w:i w:val="0"/>
-          <w:color w:val="1F3964"/>
+          <w:color w:val="ED7D31"/>
           <w:sz w:val="20"/>
         </w:rPr>
         <w:t>Step 1 — Map the process (this month)</w:t>
@@ -2462,7 +2462,70 @@
           <w:color w:val="404040"/>
           <w:sz w:val="20"/>
         </w:rPr>
-        <w:t>Before we can fix the costing process, we need to understand exactly where it waits. Trace a typical job from fabrication close to costing complete and mark every point where it pauses and why.</w:t>
+        <w:t>Trace a typical job from fabrication close to costing complete and mark every point where it pauses and why. The goal is to distinguish between:</w:t>
+      </w:r>
+    </w:p>
+    <w:p>
+      <w:pPr>
+        <w:pStyle w:val="ListBullet"/>
+        <w:spacing w:after="60"/>
+      </w:pPr>
+      <w:r>
+        <w:rPr>
+          <w:b/>
+          <w:color w:val="1F3964"/>
+          <w:sz w:val="20"/>
+        </w:rPr>
+        <w:t xml:space="preserve">A workflow problem </w:t>
+      </w:r>
+      <w:r>
+        <w:rPr>
+          <w:color w:val="404040"/>
+          <w:sz w:val="20"/>
+        </w:rPr>
+        <w:t>the process has unnecessary steps, handoffs, or approval loops</w:t>
+      </w:r>
+    </w:p>
+    <w:p>
+      <w:pPr>
+        <w:pStyle w:val="ListBullet"/>
+        <w:spacing w:after="60"/>
+      </w:pPr>
+      <w:r>
+        <w:rPr>
+          <w:b/>
+          <w:color w:val="1F3964"/>
+          <w:sz w:val="20"/>
+        </w:rPr>
+        <w:t xml:space="preserve">A capacity problem </w:t>
+      </w:r>
+      <w:r>
+        <w:rPr>
+          <w:color w:val="404040"/>
+          <w:sz w:val="20"/>
+        </w:rPr>
+        <w:t>the volume has outgrown the headcount available to do the work</w:t>
+      </w:r>
+    </w:p>
+    <w:p>
+      <w:pPr>
+        <w:pStyle w:val="ListBullet"/>
+        <w:spacing w:after="60"/>
+      </w:pPr>
+      <w:r>
+        <w:rPr>
+          <w:b/>
+          <w:color w:val="1F3964"/>
+          <w:sz w:val="20"/>
+        </w:rPr>
+        <w:t xml:space="preserve">An information problem </w:t>
+      </w:r>
+      <w:r>
+        <w:rPr>
+          <w:color w:val="404040"/>
+          <w:sz w:val="20"/>
+        </w:rPr>
+        <w:t>costing can't start because the job information from upstream is incomplete</w:t>
       </w:r>
     </w:p>
     <w:p>
@@ -2476,59 +2539,21 @@
           <w:color w:val="404040"/>
           <w:sz w:val="20"/>
         </w:rPr>
-        <w:t>Common causes to investigate:</w:t>
+        <w:t>Bring the process map to the next monthly review. That's the basis for the improvement plan.</w:t>
       </w:r>
     </w:p>
     <w:p>
       <w:pPr>
-        <w:pStyle w:val="ListBullet"/>
-        <w:spacing w:after="60"/>
+        <w:spacing w:after="80"/>
       </w:pPr>
       <w:r>
         <w:rPr>
-          <w:color w:val="404040"/>
+          <w:b/>
+          <w:i w:val="0"/>
+          <w:color w:val="ED7D31"/>
           <w:sz w:val="20"/>
         </w:rPr>
-        <w:t>Incomplete information from upstream — BOMs, job cards, actual hours</w:t>
-      </w:r>
-    </w:p>
-    <w:p>
-      <w:pPr>
-        <w:pStyle w:val="ListBullet"/>
-        <w:spacing w:after="60"/>
-      </w:pPr>
-      <w:r>
-        <w:rPr>
-          <w:color w:val="404040"/>
-          <w:sz w:val="20"/>
-        </w:rPr>
-        <w:t>Approval steps that could be streamlined or delegated</w:t>
-      </w:r>
-    </w:p>
-    <w:p>
-      <w:pPr>
-        <w:pStyle w:val="ListBullet"/>
-        <w:spacing w:after="60"/>
-      </w:pPr>
-      <w:r>
-        <w:rPr>
-          <w:color w:val="404040"/>
-          <w:sz w:val="20"/>
-        </w:rPr>
-        <w:t>Manual processes that could be systematised</w:t>
-      </w:r>
-    </w:p>
-    <w:p>
-      <w:pPr>
-        <w:pStyle w:val="ListBullet"/>
-        <w:spacing w:after="60"/>
-      </w:pPr>
-      <w:r>
-        <w:rPr>
-          <w:color w:val="404040"/>
-          <w:sz w:val="20"/>
-        </w:rPr>
-        <w:t>Capacity — is this a volume problem or a workflow problem?</w:t>
+        <w:t>Step 2 — Define what a "costable job" looks like (Month 1)</w:t>
       </w:r>
     </w:p>
     <w:p>
@@ -2542,7 +2567,7 @@
           <w:color w:val="404040"/>
           <w:sz w:val="20"/>
         </w:rPr>
-        <w:t>The output: a process map with identified bottlenecks. Bring it to the next monthly review.</w:t>
+        <w:t>If jobs arrive with incomplete hours, missing job cards, or unclear BOM actuals, costing waits. The engineering release gate addresses package quality — but Operations must define exactly what information is needed to start costing immediately on receipt. Document it. Share it with Engineering and Production.</w:t>
       </w:r>
     </w:p>
     <w:p>
@@ -2553,10 +2578,10 @@
         <w:rPr>
           <w:b/>
           <w:i w:val="0"/>
-          <w:color w:val="1F3964"/>
+          <w:color w:val="ED7D31"/>
           <w:sz w:val="20"/>
         </w:rPr>
-        <w:t>Step 2 — Define what Finance needs from upstream</w:t>
+        <w:t>Step 3 — Assess systems (within 6 months)</w:t>
       </w:r>
     </w:p>
     <w:p>
@@ -2570,35 +2595,7 @@
           <w:color w:val="404040"/>
           <w:sz w:val="20"/>
         </w:rPr>
-        <w:t>If costing is slow because engineering releases late or incomplete job information, that's an upstream fix — being addressed through the engineering release gate. Define exactly what Finance needs from each upstream function to begin costing immediately on receipt.</w:t>
-      </w:r>
-    </w:p>
-    <w:p>
-      <w:pPr>
-        <w:spacing w:after="80"/>
-      </w:pPr>
-      <w:r>
-        <w:rPr>
-          <w:b/>
-          <w:i w:val="0"/>
-          <w:color w:val="1F3964"/>
-          <w:sz w:val="20"/>
-        </w:rPr>
-        <w:t>Step 3 — Assess systems (within 6 months)</w:t>
-      </w:r>
-    </w:p>
-    <w:p>
-      <w:pPr>
-        <w:spacing w:after="80"/>
-      </w:pPr>
-      <w:r>
-        <w:rPr>
-          <w:b w:val="0"/>
-          <w:i w:val="0"/>
-          <w:color w:val="404040"/>
-          <w:sz w:val="20"/>
-        </w:rPr>
-        <w:t>The current process may be at the limit of what manual workflows can support at this volume. Assess whether an ERP or cost management system investment would materially improve turnaround. Bring a recommendation to the CEO within 6 months — not a shortlist, a recommendation.</w:t>
+        <w:t>At current volume, manual costing processes may be at their limit. Assess whether a job costing or ERP system would materially improve turnaround speed and accuracy. Bring a recommendation to the CEO within 6 months — not a shortlist, a recommendation with a preferred option and rationale.</w:t>
       </w:r>
     </w:p>
     <w:p>
@@ -2625,21 +2622,7 @@
           <w:color w:val="404040"/>
           <w:sz w:val="20"/>
         </w:rPr>
-        <w:t>Finance has something no other function has: visibility across the whole business. Revenue per head, build margins, cost per job type, costing turnaround — these numbers tell a story about the health of the operation no other manager can see in the same way.</w:t>
-      </w:r>
-    </w:p>
-    <w:p>
-      <w:pPr>
-        <w:spacing w:after="80"/>
-      </w:pPr>
-      <w:r>
-        <w:rPr>
-          <w:b w:val="0"/>
-          <w:i w:val="0"/>
-          <w:color w:val="404040"/>
-          <w:sz w:val="20"/>
-        </w:rPr>
-        <w:t>That visibility is a responsibility, not just a reporting function.</w:t>
+        <w:t>Operations sits at the intersection of production, finance, and planning. When allocation decisions are wrong or slow, every other function feels it. That cross-functional visibility is a responsibility — you are often the first person who can see when the build plan and the resourcing reality are diverging.</w:t>
       </w:r>
     </w:p>
     <w:p>
@@ -2653,7 +2636,7 @@
           <w:color w:val="404040"/>
           <w:sz w:val="20"/>
         </w:rPr>
-        <w:t>What ownership looks like for Finance:</w:t>
+        <w:t>What ownership looks like for Operations:</w:t>
       </w:r>
     </w:p>
     <w:p>
@@ -2667,14 +2650,14 @@
           <w:color w:val="1F3964"/>
           <w:sz w:val="20"/>
         </w:rPr>
-        <w:t xml:space="preserve">Surface it before being asked </w:t>
+        <w:t xml:space="preserve">Surface the backlog before being asked </w:t>
       </w:r>
       <w:r>
         <w:rPr>
           <w:color w:val="404040"/>
           <w:sz w:val="20"/>
         </w:rPr>
-        <w:t>When the numbers show something is wrong — a margin deteriorating, a job type consistently over-running — Finance raises it. Don't wait to be asked.</w:t>
+        <w:t>When you can see a costing backlog building — surface it and propose the fix before being asked. Don't wait for month-end.</w:t>
       </w:r>
     </w:p>
     <w:p>
@@ -2688,14 +2671,14 @@
           <w:color w:val="1F3964"/>
           <w:sz w:val="20"/>
         </w:rPr>
-        <w:t xml:space="preserve">Produce the financial BSC section — don't receive it </w:t>
+        <w:t xml:space="preserve">Produce the operational BSC section — don't receive it </w:t>
       </w:r>
       <w:r>
         <w:rPr>
           <w:color w:val="404040"/>
           <w:sz w:val="20"/>
         </w:rPr>
-        <w:t>The monthly financial perspective is yours to write, present, and own.</w:t>
+        <w:t>The monthly operational perspective is yours to write, present, and own. You are accountable for those numbers moving.</w:t>
       </w:r>
     </w:p>
     <w:p>
@@ -2709,14 +2692,14 @@
           <w:color w:val="1F3964"/>
           <w:sz w:val="20"/>
         </w:rPr>
-        <w:t xml:space="preserve">Come with a hypothesis, not just a number </w:t>
+        <w:t xml:space="preserve">Make allocation decisions quickly </w:t>
       </w:r>
       <w:r>
         <w:rPr>
           <w:color w:val="404040"/>
           <w:sz w:val="20"/>
         </w:rPr>
-        <w:t>When a KPI has been negative for two months, come to the review with a view on why — and what you recommend.</w:t>
+        <w:t>Allocation decisions within your authority are made and communicated quickly — not held pending perfect information.</w:t>
       </w:r>
     </w:p>
     <w:p>
@@ -2731,7 +2714,7 @@
           <w:color w:val="1F3964"/>
           <w:sz w:val="20"/>
         </w:rPr>
-        <w:t>The shift: from reporting what happened → to explaining what it means and recommending what to do next.</w:t>
+        <w:t>The shift: from processing jobs → to actively managing the throughput of the operation.</w:t>
       </w:r>
     </w:p>
     <w:p>
@@ -2850,7 +2833,7 @@
               <w:rPr>
                 <w:sz w:val="18"/>
               </w:rPr>
-              <w:t>Finance Manager</w:t>
+              <w:t>Operations Manager</w:t>
             </w:r>
           </w:p>
         </w:tc>
@@ -2864,7 +2847,7 @@
               <w:rPr>
                 <w:sz w:val="18"/>
               </w:rPr>
-              <w:t>Operations Manager</w:t>
+              <w:t>Finance Manager</w:t>
             </w:r>
           </w:p>
         </w:tc>
@@ -2894,7 +2877,7 @@
               <w:rPr>
                 <w:sz w:val="18"/>
               </w:rPr>
-              <w:t>Reporting cadence and format</w:t>
+              <w:t>Job allocation decisions (within capacity)</w:t>
             </w:r>
           </w:p>
         </w:tc>
@@ -2908,7 +2891,7 @@
               <w:rPr>
                 <w:sz w:val="18"/>
               </w:rPr>
-              <w:t>Finance Manager</w:t>
+              <w:t>Operations Manager</w:t>
             </w:r>
           </w:p>
         </w:tc>
@@ -2922,7 +2905,7 @@
               <w:rPr>
                 <w:sz w:val="18"/>
               </w:rPr>
-              <w:t>—</w:t>
+              <w:t>Production GM</w:t>
             </w:r>
           </w:p>
         </w:tc>
@@ -2952,7 +2935,7 @@
               <w:rPr>
                 <w:sz w:val="18"/>
               </w:rPr>
-              <w:t>Systems investment recommendation</w:t>
+              <w:t>Escalating resourcing constraints</w:t>
             </w:r>
           </w:p>
         </w:tc>
@@ -2966,7 +2949,7 @@
               <w:rPr>
                 <w:sz w:val="18"/>
               </w:rPr>
-              <w:t>Finance Manager</w:t>
+              <w:t>Operations Manager</w:t>
             </w:r>
           </w:p>
         </w:tc>
@@ -2980,7 +2963,7 @@
               <w:rPr>
                 <w:sz w:val="18"/>
               </w:rPr>
-              <w:t>IT / Operations</w:t>
+              <w:t>Production GM</w:t>
             </w:r>
           </w:p>
         </w:tc>
@@ -2988,6 +2971,64 @@
           <w:tcPr>
             <w:tcW w:type="dxa" w:w="2160"/>
             <w:shd w:val="clear" w:color="auto" w:fill="D6E4F0"/>
+          </w:tcPr>
+          <w:p>
+            <w:r>
+              <w:rPr>
+                <w:sz w:val="18"/>
+              </w:rPr>
+              <w:t>CEO if unresolvable</w:t>
+            </w:r>
+          </w:p>
+        </w:tc>
+      </w:tr>
+      <w:tr>
+        <w:tc>
+          <w:tcPr>
+            <w:tcW w:type="dxa" w:w="3168"/>
+            <w:shd w:val="clear" w:color="auto" w:fill="FFFFFF"/>
+          </w:tcPr>
+          <w:p>
+            <w:r>
+              <w:rPr>
+                <w:sz w:val="18"/>
+              </w:rPr>
+              <w:t>Systems investment recommendation</w:t>
+            </w:r>
+          </w:p>
+        </w:tc>
+        <w:tc>
+          <w:tcPr>
+            <w:tcW w:type="dxa" w:w="2160"/>
+            <w:shd w:val="clear" w:color="auto" w:fill="FFFFFF"/>
+          </w:tcPr>
+          <w:p>
+            <w:r>
+              <w:rPr>
+                <w:sz w:val="18"/>
+              </w:rPr>
+              <w:t>Operations Manager</w:t>
+            </w:r>
+          </w:p>
+        </w:tc>
+        <w:tc>
+          <w:tcPr>
+            <w:tcW w:type="dxa" w:w="2592"/>
+            <w:shd w:val="clear" w:color="auto" w:fill="FFFFFF"/>
+          </w:tcPr>
+          <w:p>
+            <w:r>
+              <w:rPr>
+                <w:sz w:val="18"/>
+              </w:rPr>
+              <w:t>Finance Manager</w:t>
+            </w:r>
+          </w:p>
+        </w:tc>
+        <w:tc>
+          <w:tcPr>
+            <w:tcW w:type="dxa" w:w="2160"/>
+            <w:shd w:val="clear" w:color="auto" w:fill="FFFFFF"/>
           </w:tcPr>
           <w:p>
             <w:r>
@@ -3003,64 +3044,6 @@
         <w:tc>
           <w:tcPr>
             <w:tcW w:type="dxa" w:w="3168"/>
-            <w:shd w:val="clear" w:color="auto" w:fill="FFFFFF"/>
-          </w:tcPr>
-          <w:p>
-            <w:r>
-              <w:rPr>
-                <w:sz w:val="18"/>
-              </w:rPr>
-              <w:t>Cost allocation methodology</w:t>
-            </w:r>
-          </w:p>
-        </w:tc>
-        <w:tc>
-          <w:tcPr>
-            <w:tcW w:type="dxa" w:w="2160"/>
-            <w:shd w:val="clear" w:color="auto" w:fill="FFFFFF"/>
-          </w:tcPr>
-          <w:p>
-            <w:r>
-              <w:rPr>
-                <w:sz w:val="18"/>
-              </w:rPr>
-              <w:t>Finance Manager</w:t>
-            </w:r>
-          </w:p>
-        </w:tc>
-        <w:tc>
-          <w:tcPr>
-            <w:tcW w:type="dxa" w:w="2592"/>
-            <w:shd w:val="clear" w:color="auto" w:fill="FFFFFF"/>
-          </w:tcPr>
-          <w:p>
-            <w:r>
-              <w:rPr>
-                <w:sz w:val="18"/>
-              </w:rPr>
-              <w:t>Operations Manager, Production GM</w:t>
-            </w:r>
-          </w:p>
-        </w:tc>
-        <w:tc>
-          <w:tcPr>
-            <w:tcW w:type="dxa" w:w="2160"/>
-            <w:shd w:val="clear" w:color="auto" w:fill="FFFFFF"/>
-          </w:tcPr>
-          <w:p>
-            <w:r>
-              <w:rPr>
-                <w:sz w:val="18"/>
-              </w:rPr>
-              <w:t>CEO if material change</w:t>
-            </w:r>
-          </w:p>
-        </w:tc>
-      </w:tr>
-      <w:tr>
-        <w:tc>
-          <w:tcPr>
-            <w:tcW w:type="dxa" w:w="3168"/>
             <w:shd w:val="clear" w:color="auto" w:fill="D6E4F0"/>
           </w:tcPr>
           <w:p>
@@ -3068,7 +3051,7 @@
               <w:rPr>
                 <w:sz w:val="18"/>
               </w:rPr>
-              <w:t>Flagging margin risk on specific jobs</w:t>
+              <w:t>Defining "costable job" standard</w:t>
             </w:r>
           </w:p>
         </w:tc>
@@ -3082,7 +3065,7 @@
               <w:rPr>
                 <w:sz w:val="18"/>
               </w:rPr>
-              <w:t>Finance Manager</w:t>
+              <w:t>Operations Manager</w:t>
             </w:r>
           </w:p>
         </w:tc>
@@ -3096,7 +3079,7 @@
               <w:rPr>
                 <w:sz w:val="18"/>
               </w:rPr>
-              <w:t>Relevant GM</w:t>
+              <w:t>Engineering Manager</w:t>
             </w:r>
           </w:p>
         </w:tc>
@@ -3110,7 +3093,7 @@
               <w:rPr>
                 <w:sz w:val="18"/>
               </w:rPr>
-              <w:t>CEO if threshold exceeded</w:t>
+              <w:t>—</w:t>
             </w:r>
           </w:p>
         </w:tc>
@@ -3127,7 +3110,7 @@
           <w:color w:val="1F3964"/>
           <w:sz w:val="28"/>
         </w:rPr>
-        <w:t>Finance KPI Summary</w:t>
+        <w:t>Operations KPI Summary</w:t>
       </w:r>
     </w:p>
     <w:tbl>
@@ -3216,7 +3199,7 @@
               <w:rPr>
                 <w:sz w:val="18"/>
               </w:rPr>
-              <w:t>Finance Manager</w:t>
+              <w:t>Operations Manager</w:t>
             </w:r>
           </w:p>
         </w:tc>
@@ -3246,7 +3229,7 @@
               <w:rPr>
                 <w:sz w:val="18"/>
               </w:rPr>
-              <w:t>Revenue per head ($)</w:t>
+              <w:t>Allocation accuracy (jobs to plan)</w:t>
             </w:r>
           </w:p>
         </w:tc>
@@ -3260,7 +3243,7 @@
               <w:rPr>
                 <w:sz w:val="18"/>
               </w:rPr>
-              <w:t>Finance Manager (tracking)</w:t>
+              <w:t>Operations Manager</w:t>
             </w:r>
           </w:p>
         </w:tc>
@@ -3274,7 +3257,7 @@
               <w:rPr>
                 <w:sz w:val="18"/>
               </w:rPr>
-              <w:t>Increase YoY</w:t>
+              <w:t>Baseline + improve QoQ</w:t>
             </w:r>
           </w:p>
         </w:tc>
@@ -3290,7 +3273,7 @@
               <w:rPr>
                 <w:sz w:val="18"/>
               </w:rPr>
-              <w:t>BSC financial perspective (monthly)</w:t>
+              <w:t>BSC operational perspective (monthly)</w:t>
             </w:r>
           </w:p>
         </w:tc>
@@ -3304,7 +3287,7 @@
               <w:rPr>
                 <w:sz w:val="18"/>
               </w:rPr>
-              <w:t>Finance Manager</w:t>
+              <w:t>Operations Manager</w:t>
             </w:r>
           </w:p>
         </w:tc>
@@ -3334,7 +3317,1005 @@
               <w:rPr>
                 <w:sz w:val="18"/>
               </w:rPr>
-              <w:t>Systems investment recommendation</w:t>
+              <w:t>Systems recommendation</w:t>
+            </w:r>
+          </w:p>
+        </w:tc>
+        <w:tc>
+          <w:tcPr>
+            <w:tcW w:type="dxa" w:w="2592"/>
+            <w:shd w:val="clear" w:color="auto" w:fill="FFFFFF"/>
+          </w:tcPr>
+          <w:p>
+            <w:r>
+              <w:rPr>
+                <w:sz w:val="18"/>
+              </w:rPr>
+              <w:t>Operations Manager</w:t>
+            </w:r>
+          </w:p>
+        </w:tc>
+        <w:tc>
+          <w:tcPr>
+            <w:tcW w:type="dxa" w:w="2880"/>
+            <w:shd w:val="clear" w:color="auto" w:fill="FFFFFF"/>
+          </w:tcPr>
+          <w:p>
+            <w:r>
+              <w:rPr>
+                <w:sz w:val="18"/>
+              </w:rPr>
+              <w:t>Delivered within 6 months</w:t>
+            </w:r>
+          </w:p>
+        </w:tc>
+      </w:tr>
+    </w:tbl>
+    <w:p/>
+    <w:p>
+      <w:pPr>
+        <w:spacing w:before="160" w:after="80"/>
+      </w:pPr>
+      <w:r>
+        <w:rPr>
+          <w:b/>
+          <w:color w:val="1F3964"/>
+          <w:sz w:val="28"/>
+        </w:rPr>
+        <w:t>The Ask of Operations</w:t>
+      </w:r>
+    </w:p>
+    <w:p>
+      <w:pPr>
+        <w:pStyle w:val="ListNumber"/>
+        <w:spacing w:after="80"/>
+      </w:pPr>
+      <w:r>
+        <w:rPr>
+          <w:color w:val="404040"/>
+          <w:sz w:val="20"/>
+        </w:rPr>
+        <w:t>Map the costing process this month — where does it wait, and why?</w:t>
+      </w:r>
+    </w:p>
+    <w:p>
+      <w:pPr>
+        <w:pStyle w:val="ListNumber"/>
+        <w:spacing w:after="80"/>
+      </w:pPr>
+      <w:r>
+        <w:rPr>
+          <w:color w:val="404040"/>
+          <w:sz w:val="20"/>
+        </w:rPr>
+        <w:t>Define what a "costable job" looks like — share it with Engineering and Production</w:t>
+      </w:r>
+    </w:p>
+    <w:p>
+      <w:pPr>
+        <w:pStyle w:val="ListNumber"/>
+        <w:spacing w:after="80"/>
+      </w:pPr>
+      <w:r>
+        <w:rPr>
+          <w:color w:val="404040"/>
+          <w:sz w:val="20"/>
+        </w:rPr>
+        <w:t>Assess systems and bring a recommendation within 6 months</w:t>
+      </w:r>
+    </w:p>
+    <w:p>
+      <w:pPr>
+        <w:pStyle w:val="ListNumber"/>
+        <w:spacing w:after="80"/>
+      </w:pPr>
+      <w:r>
+        <w:rPr>
+          <w:color w:val="404040"/>
+          <w:sz w:val="20"/>
+        </w:rPr>
+        <w:t>Surface backlog build-up before being asked — don't wait for month-end to raise it</w:t>
+      </w:r>
+    </w:p>
+    <w:p>
+      <w:r>
+        <w:br w:type="page"/>
+      </w:r>
+    </w:p>
+    <w:p>
+      <w:pPr>
+        <w:spacing w:before="120" w:after="0"/>
+        <w:shd w:val="clear" w:color="auto" w:fill="70AD47"/>
+      </w:pPr>
+      <w:r>
+        <w:rPr>
+          <w:b/>
+          <w:color w:val="FFFFFF"/>
+          <w:sz w:val="40"/>
+        </w:rPr>
+        <w:t>PART FOUR — FINANCE</w:t>
+      </w:r>
+    </w:p>
+    <w:p>
+      <w:pPr>
+        <w:spacing w:before="0" w:after="240"/>
+        <w:shd w:val="clear" w:color="auto" w:fill="70AD47"/>
+      </w:pPr>
+      <w:r>
+        <w:rPr>
+          <w:i/>
+          <w:color w:val="CCD6E8"/>
+          <w:sz w:val="22"/>
+        </w:rPr>
+        <w:t>Finance Manager</w:t>
+      </w:r>
+    </w:p>
+    <w:p>
+      <w:pPr>
+        <w:spacing w:before="280" w:after="80"/>
+      </w:pPr>
+      <w:r>
+        <w:rPr>
+          <w:b/>
+          <w:color w:val="1F3964"/>
+          <w:sz w:val="36"/>
+        </w:rPr>
+        <w:t>Your Role in the Business</w:t>
+      </w:r>
+    </w:p>
+    <w:p>
+      <w:pPr>
+        <w:spacing w:before="40" w:after="40"/>
+      </w:pPr>
+      <w:r>
+        <w:rPr>
+          <w:color w:val="BDBDBD"/>
+          <w:sz w:val="16"/>
+        </w:rPr>
+        <w:t>────────────────────────────────────────────────────────────────────────────────</w:t>
+      </w:r>
+    </w:p>
+    <w:p>
+      <w:pPr>
+        <w:spacing w:after="80"/>
+      </w:pPr>
+      <w:r>
+        <w:rPr>
+          <w:b w:val="0"/>
+          <w:i w:val="0"/>
+          <w:color w:val="404040"/>
+          <w:sz w:val="20"/>
+        </w:rPr>
+        <w:t>Finance's role in this business is not costing — that sits with Operations. Finance's mandate is the financial integrity and visibility of the operation: accurate job time reporting, AP and AR management, and the monthly financial narrative that tells leadership whether the business is performing as expected.</w:t>
+      </w:r>
+    </w:p>
+    <w:p>
+      <w:pPr>
+        <w:spacing w:before="120" w:after="120"/>
+        <w:ind w:left="432" w:right="432"/>
+        <w:shd w:val="clear" w:color="auto" w:fill="D6E4F0"/>
+      </w:pPr>
+      <w:r>
+        <w:rPr>
+          <w:i/>
+          <w:color w:val="1F3964"/>
+          <w:sz w:val="20"/>
+        </w:rPr>
+        <w:t>Done well, Finance is an early warning system. Done poorly, Finance is a reporting function that confirms what everyone already suspects.</w:t>
+      </w:r>
+    </w:p>
+    <w:p>
+      <w:pPr>
+        <w:spacing w:before="160" w:after="80"/>
+      </w:pPr>
+      <w:r>
+        <w:rPr>
+          <w:b/>
+          <w:color w:val="1F3964"/>
+          <w:sz w:val="28"/>
+        </w:rPr>
+        <w:t>Job Time Reporting — a Strategic Asset</w:t>
+      </w:r>
+    </w:p>
+    <w:p>
+      <w:pPr>
+        <w:spacing w:after="80"/>
+      </w:pPr>
+      <w:r>
+        <w:rPr>
+          <w:b w:val="0"/>
+          <w:i w:val="0"/>
+          <w:color w:val="404040"/>
+          <w:sz w:val="20"/>
+        </w:rPr>
+        <w:t>Finance tracks actual job hours. Right now that data is used for reporting. It should also be used for improvement.</w:t>
+      </w:r>
+    </w:p>
+    <w:p>
+      <w:pPr>
+        <w:spacing w:after="80"/>
+      </w:pPr>
+      <w:r>
+        <w:rPr>
+          <w:b/>
+          <w:i w:val="0"/>
+          <w:color w:val="404040"/>
+          <w:sz w:val="20"/>
+        </w:rPr>
+        <w:t>What changes:</w:t>
+      </w:r>
+    </w:p>
+    <w:p>
+      <w:pPr>
+        <w:pStyle w:val="ListBullet"/>
+        <w:spacing w:after="60"/>
+      </w:pPr>
+      <w:r>
+        <w:rPr>
+          <w:color w:val="404040"/>
+          <w:sz w:val="20"/>
+        </w:rPr>
+        <w:t>Actual hours by job type are shared with Engineering Manager monthly — this is the actuals database that makes future estimates more accurate</w:t>
+      </w:r>
+    </w:p>
+    <w:p>
+      <w:pPr>
+        <w:pStyle w:val="ListBullet"/>
+        <w:spacing w:after="60"/>
+      </w:pPr>
+      <w:r>
+        <w:rPr>
+          <w:color w:val="404040"/>
+          <w:sz w:val="20"/>
+        </w:rPr>
+        <w:t>Variance reports (actual vs estimated hours) are produced and presented, not just filed</w:t>
+      </w:r>
+    </w:p>
+    <w:p>
+      <w:pPr>
+        <w:pStyle w:val="ListBullet"/>
+        <w:spacing w:after="60"/>
+      </w:pPr>
+      <w:r>
+        <w:rPr>
+          <w:color w:val="404040"/>
+          <w:sz w:val="20"/>
+        </w:rPr>
+        <w:t>When a job type is consistently running over estimate, Finance flags it — it's a signal of either a scoping problem in Engineering or a production problem on the floor</w:t>
+      </w:r>
+    </w:p>
+    <w:p>
+      <w:pPr>
+        <w:spacing w:after="40"/>
+      </w:pPr>
+      <w:r>
+        <w:rPr>
+          <w:b/>
+          <w:i w:val="0"/>
+          <w:color w:val="1F3964"/>
+          <w:sz w:val="20"/>
+        </w:rPr>
+        <w:t>System consideration:</w:t>
+      </w:r>
+    </w:p>
+    <w:p>
+      <w:pPr>
+        <w:spacing w:after="80"/>
+      </w:pPr>
+      <w:r>
+        <w:rPr>
+          <w:b w:val="0"/>
+          <w:i w:val="0"/>
+          <w:color w:val="404040"/>
+          <w:sz w:val="20"/>
+        </w:rPr>
+        <w:t>If job time monitoring is currently manual, the volume of work at 160 people makes this worth reviewing. A proper time and job tracking system — even a lightweight one — would improve both the accuracy and the speed of this data. Bring a view on this within 6 months.</w:t>
+      </w:r>
+    </w:p>
+    <w:p>
+      <w:pPr>
+        <w:spacing w:before="160" w:after="80"/>
+      </w:pPr>
+      <w:r>
+        <w:rPr>
+          <w:b/>
+          <w:color w:val="1F3964"/>
+          <w:sz w:val="28"/>
+        </w:rPr>
+        <w:t>AP and AR — Cash is the Engine</w:t>
+      </w:r>
+    </w:p>
+    <w:p>
+      <w:pPr>
+        <w:spacing w:after="80"/>
+      </w:pPr>
+      <w:r>
+        <w:rPr>
+          <w:b w:val="0"/>
+          <w:i w:val="0"/>
+          <w:color w:val="404040"/>
+          <w:sz w:val="20"/>
+        </w:rPr>
+        <w:t>At $70–100M revenue and growing, the timing of AP and AR is a cash flow lever, not just an admin function.</w:t>
+      </w:r>
+    </w:p>
+    <w:p>
+      <w:pPr>
+        <w:spacing w:after="40"/>
+      </w:pPr>
+      <w:r>
+        <w:rPr>
+          <w:b/>
+          <w:i w:val="0"/>
+          <w:color w:val="1F3964"/>
+          <w:sz w:val="20"/>
+        </w:rPr>
+        <w:t>AR:</w:t>
+      </w:r>
+    </w:p>
+    <w:p>
+      <w:pPr>
+        <w:spacing w:after="80"/>
+      </w:pPr>
+      <w:r>
+        <w:rPr>
+          <w:b w:val="0"/>
+          <w:i w:val="0"/>
+          <w:color w:val="404040"/>
+          <w:sz w:val="20"/>
+        </w:rPr>
+        <w:t>Customer invoices go out promptly when jobs close. A job that sits in the costing queue is a job not yet invoiced. The costing turnaround improvement in Operations directly improves AR timing — Finance and Operations are connected here.</w:t>
+      </w:r>
+    </w:p>
+    <w:p>
+      <w:pPr>
+        <w:spacing w:after="40"/>
+      </w:pPr>
+      <w:r>
+        <w:rPr>
+          <w:b/>
+          <w:i w:val="0"/>
+          <w:color w:val="1F3964"/>
+          <w:sz w:val="20"/>
+        </w:rPr>
+        <w:t>AP:</w:t>
+      </w:r>
+    </w:p>
+    <w:p>
+      <w:pPr>
+        <w:spacing w:after="80"/>
+      </w:pPr>
+      <w:r>
+        <w:rPr>
+          <w:b w:val="0"/>
+          <w:i w:val="0"/>
+          <w:color w:val="404040"/>
+          <w:sz w:val="20"/>
+        </w:rPr>
+        <w:t>Supplier payment terms are managed actively. Early payment discounts are taken where they make sense. Overdue supplier relationships are flagged before they become supply chain problems.</w:t>
+      </w:r>
+    </w:p>
+    <w:p>
+      <w:pPr>
+        <w:spacing w:before="160" w:after="80"/>
+      </w:pPr>
+      <w:r>
+        <w:rPr>
+          <w:b/>
+          <w:color w:val="1F3964"/>
+          <w:sz w:val="28"/>
+        </w:rPr>
+        <w:t>Monthly Finance Reports — Own the Narrative</w:t>
+      </w:r>
+    </w:p>
+    <w:p>
+      <w:pPr>
+        <w:spacing w:after="80"/>
+      </w:pPr>
+      <w:r>
+        <w:rPr>
+          <w:b w:val="0"/>
+          <w:i w:val="0"/>
+          <w:color w:val="404040"/>
+          <w:sz w:val="20"/>
+        </w:rPr>
+        <w:t>The monthly finance report is not a spreadsheet sent to leadership. It is Finance's interpretation of what the numbers mean for the business — produced by Finance, presented by Finance, owned by Finance.</w:t>
+      </w:r>
+    </w:p>
+    <w:p>
+      <w:pPr>
+        <w:spacing w:after="80"/>
+      </w:pPr>
+      <w:r>
+        <w:rPr>
+          <w:b/>
+          <w:i w:val="0"/>
+          <w:color w:val="404040"/>
+          <w:sz w:val="20"/>
+        </w:rPr>
+        <w:t>What this looks like:</w:t>
+      </w:r>
+    </w:p>
+    <w:p>
+      <w:pPr>
+        <w:pStyle w:val="ListBullet"/>
+        <w:spacing w:after="60"/>
+      </w:pPr>
+      <w:r>
+        <w:rPr>
+          <w:color w:val="404040"/>
+          <w:sz w:val="20"/>
+        </w:rPr>
+        <w:t>Revenue per head trending — is throughput improving or declining per person?</w:t>
+      </w:r>
+    </w:p>
+    <w:p>
+      <w:pPr>
+        <w:pStyle w:val="ListBullet"/>
+        <w:spacing w:after="60"/>
+      </w:pPr>
+      <w:r>
+        <w:rPr>
+          <w:color w:val="404040"/>
+          <w:sz w:val="20"/>
+        </w:rPr>
+        <w:t>Margin by job type — are some product types consistently under-performing?</w:t>
+      </w:r>
+    </w:p>
+    <w:p>
+      <w:pPr>
+        <w:pStyle w:val="ListBullet"/>
+        <w:spacing w:after="60"/>
+      </w:pPr>
+      <w:r>
+        <w:rPr>
+          <w:color w:val="404040"/>
+          <w:sz w:val="20"/>
+        </w:rPr>
+        <w:t>Cash position and forecast — where are the next 90 days heading?</w:t>
+      </w:r>
+    </w:p>
+    <w:p>
+      <w:pPr>
+        <w:pStyle w:val="ListBullet"/>
+        <w:spacing w:after="60"/>
+      </w:pPr>
+      <w:r>
+        <w:rPr>
+          <w:color w:val="404040"/>
+          <w:sz w:val="20"/>
+        </w:rPr>
+        <w:t>BSC financial perspective — produced by Finance for the monthly review</w:t>
+      </w:r>
+    </w:p>
+    <w:p>
+      <w:pPr>
+        <w:spacing w:before="120" w:after="120"/>
+        <w:ind w:left="432" w:right="432"/>
+        <w:shd w:val="clear" w:color="auto" w:fill="D6E4F0"/>
+      </w:pPr>
+      <w:r>
+        <w:rPr>
+          <w:i/>
+          <w:color w:val="1F3964"/>
+          <w:sz w:val="20"/>
+        </w:rPr>
+        <w:t>The shift: from distributing numbers → to interpreting them and recommending action.</w:t>
+      </w:r>
+    </w:p>
+    <w:p>
+      <w:pPr>
+        <w:spacing w:before="160" w:after="80"/>
+      </w:pPr>
+      <w:r>
+        <w:rPr>
+          <w:b/>
+          <w:color w:val="1F3964"/>
+          <w:sz w:val="28"/>
+        </w:rPr>
+        <w:t>Your Decision Rights</w:t>
+      </w:r>
+    </w:p>
+    <w:tbl>
+      <w:tblPr>
+        <w:tblStyle w:val="TableGrid"/>
+        <w:tblW w:type="auto" w:w="0"/>
+        <w:tblLook w:firstColumn="1" w:firstRow="1" w:lastColumn="0" w:lastRow="0" w:noHBand="0" w:noVBand="1" w:val="04A0"/>
+      </w:tblPr>
+      <w:tblGrid>
+        <w:gridCol w:w="2351"/>
+        <w:gridCol w:w="2351"/>
+        <w:gridCol w:w="2351"/>
+        <w:gridCol w:w="2351"/>
+      </w:tblGrid>
+      <w:tr>
+        <w:tc>
+          <w:tcPr>
+            <w:tcW w:type="dxa" w:w="3168"/>
+            <w:shd w:val="clear" w:color="auto" w:fill="70AD47"/>
+          </w:tcPr>
+          <w:p>
+            <w:r>
+              <w:rPr>
+                <w:b/>
+                <w:color w:val="FFFFFF"/>
+                <w:sz w:val="18"/>
+              </w:rPr>
+              <w:t>Decision</w:t>
+            </w:r>
+          </w:p>
+        </w:tc>
+        <w:tc>
+          <w:tcPr>
+            <w:tcW w:type="dxa" w:w="2160"/>
+            <w:shd w:val="clear" w:color="auto" w:fill="70AD47"/>
+          </w:tcPr>
+          <w:p>
+            <w:r>
+              <w:rPr>
+                <w:b/>
+                <w:color w:val="FFFFFF"/>
+                <w:sz w:val="18"/>
+              </w:rPr>
+              <w:t>Owner</w:t>
+            </w:r>
+          </w:p>
+        </w:tc>
+        <w:tc>
+          <w:tcPr>
+            <w:tcW w:type="dxa" w:w="2592"/>
+            <w:shd w:val="clear" w:color="auto" w:fill="70AD47"/>
+          </w:tcPr>
+          <w:p>
+            <w:r>
+              <w:rPr>
+                <w:b/>
+                <w:color w:val="FFFFFF"/>
+                <w:sz w:val="18"/>
+              </w:rPr>
+              <w:t>Consult</w:t>
+            </w:r>
+          </w:p>
+        </w:tc>
+        <w:tc>
+          <w:tcPr>
+            <w:tcW w:type="dxa" w:w="2160"/>
+            <w:shd w:val="clear" w:color="auto" w:fill="70AD47"/>
+          </w:tcPr>
+          <w:p>
+            <w:r>
+              <w:rPr>
+                <w:b/>
+                <w:color w:val="FFFFFF"/>
+                <w:sz w:val="18"/>
+              </w:rPr>
+              <w:t>Escalate to</w:t>
+            </w:r>
+          </w:p>
+        </w:tc>
+      </w:tr>
+      <w:tr>
+        <w:tc>
+          <w:tcPr>
+            <w:tcW w:type="dxa" w:w="3168"/>
+            <w:shd w:val="clear" w:color="auto" w:fill="D6E4F0"/>
+          </w:tcPr>
+          <w:p>
+            <w:r>
+              <w:rPr>
+                <w:sz w:val="18"/>
+              </w:rPr>
+              <w:t>Reporting format and cadence</w:t>
+            </w:r>
+          </w:p>
+        </w:tc>
+        <w:tc>
+          <w:tcPr>
+            <w:tcW w:type="dxa" w:w="2160"/>
+            <w:shd w:val="clear" w:color="auto" w:fill="D6E4F0"/>
+          </w:tcPr>
+          <w:p>
+            <w:r>
+              <w:rPr>
+                <w:sz w:val="18"/>
+              </w:rPr>
+              <w:t>Finance Manager</w:t>
+            </w:r>
+          </w:p>
+        </w:tc>
+        <w:tc>
+          <w:tcPr>
+            <w:tcW w:type="dxa" w:w="2592"/>
+            <w:shd w:val="clear" w:color="auto" w:fill="D6E4F0"/>
+          </w:tcPr>
+          <w:p>
+            <w:r>
+              <w:rPr>
+                <w:sz w:val="18"/>
+              </w:rPr>
+              <w:t>—</w:t>
+            </w:r>
+          </w:p>
+        </w:tc>
+        <w:tc>
+          <w:tcPr>
+            <w:tcW w:type="dxa" w:w="2160"/>
+            <w:shd w:val="clear" w:color="auto" w:fill="D6E4F0"/>
+          </w:tcPr>
+          <w:p>
+            <w:r>
+              <w:rPr>
+                <w:sz w:val="18"/>
+              </w:rPr>
+              <w:t>—</w:t>
+            </w:r>
+          </w:p>
+        </w:tc>
+      </w:tr>
+      <w:tr>
+        <w:tc>
+          <w:tcPr>
+            <w:tcW w:type="dxa" w:w="3168"/>
+            <w:shd w:val="clear" w:color="auto" w:fill="FFFFFF"/>
+          </w:tcPr>
+          <w:p>
+            <w:r>
+              <w:rPr>
+                <w:sz w:val="18"/>
+              </w:rPr>
+              <w:t>Job time system recommendation</w:t>
+            </w:r>
+          </w:p>
+        </w:tc>
+        <w:tc>
+          <w:tcPr>
+            <w:tcW w:type="dxa" w:w="2160"/>
+            <w:shd w:val="clear" w:color="auto" w:fill="FFFFFF"/>
+          </w:tcPr>
+          <w:p>
+            <w:r>
+              <w:rPr>
+                <w:sz w:val="18"/>
+              </w:rPr>
+              <w:t>Finance Manager</w:t>
+            </w:r>
+          </w:p>
+        </w:tc>
+        <w:tc>
+          <w:tcPr>
+            <w:tcW w:type="dxa" w:w="2592"/>
+            <w:shd w:val="clear" w:color="auto" w:fill="FFFFFF"/>
+          </w:tcPr>
+          <w:p>
+            <w:r>
+              <w:rPr>
+                <w:sz w:val="18"/>
+              </w:rPr>
+              <w:t>IT / Operations</w:t>
+            </w:r>
+          </w:p>
+        </w:tc>
+        <w:tc>
+          <w:tcPr>
+            <w:tcW w:type="dxa" w:w="2160"/>
+            <w:shd w:val="clear" w:color="auto" w:fill="FFFFFF"/>
+          </w:tcPr>
+          <w:p>
+            <w:r>
+              <w:rPr>
+                <w:sz w:val="18"/>
+              </w:rPr>
+              <w:t>CEO (approval)</w:t>
+            </w:r>
+          </w:p>
+        </w:tc>
+      </w:tr>
+      <w:tr>
+        <w:tc>
+          <w:tcPr>
+            <w:tcW w:type="dxa" w:w="3168"/>
+            <w:shd w:val="clear" w:color="auto" w:fill="D6E4F0"/>
+          </w:tcPr>
+          <w:p>
+            <w:r>
+              <w:rPr>
+                <w:sz w:val="18"/>
+              </w:rPr>
+              <w:t>AP payment timing within policy</w:t>
+            </w:r>
+          </w:p>
+        </w:tc>
+        <w:tc>
+          <w:tcPr>
+            <w:tcW w:type="dxa" w:w="2160"/>
+            <w:shd w:val="clear" w:color="auto" w:fill="D6E4F0"/>
+          </w:tcPr>
+          <w:p>
+            <w:r>
+              <w:rPr>
+                <w:sz w:val="18"/>
+              </w:rPr>
+              <w:t>Finance Manager</w:t>
+            </w:r>
+          </w:p>
+        </w:tc>
+        <w:tc>
+          <w:tcPr>
+            <w:tcW w:type="dxa" w:w="2592"/>
+            <w:shd w:val="clear" w:color="auto" w:fill="D6E4F0"/>
+          </w:tcPr>
+          <w:p>
+            <w:r>
+              <w:rPr>
+                <w:sz w:val="18"/>
+              </w:rPr>
+              <w:t>—</w:t>
+            </w:r>
+          </w:p>
+        </w:tc>
+        <w:tc>
+          <w:tcPr>
+            <w:tcW w:type="dxa" w:w="2160"/>
+            <w:shd w:val="clear" w:color="auto" w:fill="D6E4F0"/>
+          </w:tcPr>
+          <w:p>
+            <w:r>
+              <w:rPr>
+                <w:sz w:val="18"/>
+              </w:rPr>
+              <w:t>—</w:t>
+            </w:r>
+          </w:p>
+        </w:tc>
+      </w:tr>
+      <w:tr>
+        <w:tc>
+          <w:tcPr>
+            <w:tcW w:type="dxa" w:w="3168"/>
+            <w:shd w:val="clear" w:color="auto" w:fill="FFFFFF"/>
+          </w:tcPr>
+          <w:p>
+            <w:r>
+              <w:rPr>
+                <w:sz w:val="18"/>
+              </w:rPr>
+              <w:t>AR follow-up process</w:t>
+            </w:r>
+          </w:p>
+        </w:tc>
+        <w:tc>
+          <w:tcPr>
+            <w:tcW w:type="dxa" w:w="2160"/>
+            <w:shd w:val="clear" w:color="auto" w:fill="FFFFFF"/>
+          </w:tcPr>
+          <w:p>
+            <w:r>
+              <w:rPr>
+                <w:sz w:val="18"/>
+              </w:rPr>
+              <w:t>Finance Manager</w:t>
+            </w:r>
+          </w:p>
+        </w:tc>
+        <w:tc>
+          <w:tcPr>
+            <w:tcW w:type="dxa" w:w="2592"/>
+            <w:shd w:val="clear" w:color="auto" w:fill="FFFFFF"/>
+          </w:tcPr>
+          <w:p>
+            <w:r>
+              <w:rPr>
+                <w:sz w:val="18"/>
+              </w:rPr>
+              <w:t>Sales Manager</w:t>
+            </w:r>
+          </w:p>
+        </w:tc>
+        <w:tc>
+          <w:tcPr>
+            <w:tcW w:type="dxa" w:w="2160"/>
+            <w:shd w:val="clear" w:color="auto" w:fill="FFFFFF"/>
+          </w:tcPr>
+          <w:p>
+            <w:r>
+              <w:rPr>
+                <w:sz w:val="18"/>
+              </w:rPr>
+              <w:t>—</w:t>
+            </w:r>
+          </w:p>
+        </w:tc>
+      </w:tr>
+      <w:tr>
+        <w:tc>
+          <w:tcPr>
+            <w:tcW w:type="dxa" w:w="3168"/>
+            <w:shd w:val="clear" w:color="auto" w:fill="D6E4F0"/>
+          </w:tcPr>
+          <w:p>
+            <w:r>
+              <w:rPr>
+                <w:sz w:val="18"/>
+              </w:rPr>
+              <w:t>Flagging margin or cash risk</w:t>
+            </w:r>
+          </w:p>
+        </w:tc>
+        <w:tc>
+          <w:tcPr>
+            <w:tcW w:type="dxa" w:w="2160"/>
+            <w:shd w:val="clear" w:color="auto" w:fill="D6E4F0"/>
+          </w:tcPr>
+          <w:p>
+            <w:r>
+              <w:rPr>
+                <w:sz w:val="18"/>
+              </w:rPr>
+              <w:t>Finance Manager</w:t>
+            </w:r>
+          </w:p>
+        </w:tc>
+        <w:tc>
+          <w:tcPr>
+            <w:tcW w:type="dxa" w:w="2592"/>
+            <w:shd w:val="clear" w:color="auto" w:fill="D6E4F0"/>
+          </w:tcPr>
+          <w:p>
+            <w:r>
+              <w:rPr>
+                <w:sz w:val="18"/>
+              </w:rPr>
+              <w:t>Relevant GM</w:t>
+            </w:r>
+          </w:p>
+        </w:tc>
+        <w:tc>
+          <w:tcPr>
+            <w:tcW w:type="dxa" w:w="2160"/>
+            <w:shd w:val="clear" w:color="auto" w:fill="D6E4F0"/>
+          </w:tcPr>
+          <w:p>
+            <w:r>
+              <w:rPr>
+                <w:sz w:val="18"/>
+              </w:rPr>
+              <w:t>CEO if material</w:t>
+            </w:r>
+          </w:p>
+        </w:tc>
+      </w:tr>
+    </w:tbl>
+    <w:p/>
+    <w:p>
+      <w:pPr>
+        <w:spacing w:before="160" w:after="80"/>
+      </w:pPr>
+      <w:r>
+        <w:rPr>
+          <w:b/>
+          <w:color w:val="1F3964"/>
+          <w:sz w:val="28"/>
+        </w:rPr>
+        <w:t>Finance KPI Summary</w:t>
+      </w:r>
+    </w:p>
+    <w:tbl>
+      <w:tblPr>
+        <w:tblStyle w:val="TableGrid"/>
+        <w:tblW w:type="auto" w:w="0"/>
+        <w:tblLook w:firstColumn="1" w:firstRow="1" w:lastColumn="0" w:lastRow="0" w:noHBand="0" w:noVBand="1" w:val="04A0"/>
+      </w:tblPr>
+      <w:tblGrid>
+        <w:gridCol w:w="3135"/>
+        <w:gridCol w:w="3135"/>
+        <w:gridCol w:w="3135"/>
+      </w:tblGrid>
+      <w:tr>
+        <w:tc>
+          <w:tcPr>
+            <w:tcW w:type="dxa" w:w="4032"/>
+            <w:shd w:val="clear" w:color="auto" w:fill="70AD47"/>
+          </w:tcPr>
+          <w:p>
+            <w:r>
+              <w:rPr>
+                <w:b/>
+                <w:color w:val="FFFFFF"/>
+                <w:sz w:val="18"/>
+              </w:rPr>
+              <w:t>KPI</w:t>
+            </w:r>
+          </w:p>
+        </w:tc>
+        <w:tc>
+          <w:tcPr>
+            <w:tcW w:type="dxa" w:w="2592"/>
+            <w:shd w:val="clear" w:color="auto" w:fill="70AD47"/>
+          </w:tcPr>
+          <w:p>
+            <w:r>
+              <w:rPr>
+                <w:b/>
+                <w:color w:val="FFFFFF"/>
+                <w:sz w:val="18"/>
+              </w:rPr>
+              <w:t>Owner</w:t>
+            </w:r>
+          </w:p>
+        </w:tc>
+        <w:tc>
+          <w:tcPr>
+            <w:tcW w:type="dxa" w:w="2880"/>
+            <w:shd w:val="clear" w:color="auto" w:fill="70AD47"/>
+          </w:tcPr>
+          <w:p>
+            <w:r>
+              <w:rPr>
+                <w:b/>
+                <w:color w:val="FFFFFF"/>
+                <w:sz w:val="18"/>
+              </w:rPr>
+              <w:t>Target</w:t>
+            </w:r>
+          </w:p>
+        </w:tc>
+      </w:tr>
+      <w:tr>
+        <w:tc>
+          <w:tcPr>
+            <w:tcW w:type="dxa" w:w="4032"/>
+            <w:shd w:val="clear" w:color="auto" w:fill="D6E4F0"/>
+          </w:tcPr>
+          <w:p>
+            <w:r>
+              <w:rPr>
+                <w:sz w:val="18"/>
+              </w:rPr>
+              <w:t>Revenue per head ($)</w:t>
+            </w:r>
+          </w:p>
+        </w:tc>
+        <w:tc>
+          <w:tcPr>
+            <w:tcW w:type="dxa" w:w="2592"/>
+            <w:shd w:val="clear" w:color="auto" w:fill="D6E4F0"/>
+          </w:tcPr>
+          <w:p>
+            <w:r>
+              <w:rPr>
+                <w:sz w:val="18"/>
+              </w:rPr>
+              <w:t>Finance Manager (tracking)</w:t>
+            </w:r>
+          </w:p>
+        </w:tc>
+        <w:tc>
+          <w:tcPr>
+            <w:tcW w:type="dxa" w:w="2880"/>
+            <w:shd w:val="clear" w:color="auto" w:fill="D6E4F0"/>
+          </w:tcPr>
+          <w:p>
+            <w:r>
+              <w:rPr>
+                <w:sz w:val="18"/>
+              </w:rPr>
+              <w:t>Increase YoY</w:t>
+            </w:r>
+          </w:p>
+        </w:tc>
+      </w:tr>
+      <w:tr>
+        <w:tc>
+          <w:tcPr>
+            <w:tcW w:type="dxa" w:w="4032"/>
+            <w:shd w:val="clear" w:color="auto" w:fill="FFFFFF"/>
+          </w:tcPr>
+          <w:p>
+            <w:r>
+              <w:rPr>
+                <w:sz w:val="18"/>
+              </w:rPr>
+              <w:t>Debtors days (AR turnaround)</w:t>
             </w:r>
           </w:p>
         </w:tc>
@@ -3362,7 +4343,139 @@
               <w:rPr>
                 <w:sz w:val="18"/>
               </w:rPr>
-              <w:t>Delivered within 6 months</w:t>
+              <w:t>Baseline + improve</w:t>
+            </w:r>
+          </w:p>
+        </w:tc>
+      </w:tr>
+      <w:tr>
+        <w:tc>
+          <w:tcPr>
+            <w:tcW w:type="dxa" w:w="4032"/>
+            <w:shd w:val="clear" w:color="auto" w:fill="D6E4F0"/>
+          </w:tcPr>
+          <w:p>
+            <w:r>
+              <w:rPr>
+                <w:sz w:val="18"/>
+              </w:rPr>
+              <w:t>Job time variance report (monthly)</w:t>
+            </w:r>
+          </w:p>
+        </w:tc>
+        <w:tc>
+          <w:tcPr>
+            <w:tcW w:type="dxa" w:w="2592"/>
+            <w:shd w:val="clear" w:color="auto" w:fill="D6E4F0"/>
+          </w:tcPr>
+          <w:p>
+            <w:r>
+              <w:rPr>
+                <w:sz w:val="18"/>
+              </w:rPr>
+              <w:t>Finance Manager</w:t>
+            </w:r>
+          </w:p>
+        </w:tc>
+        <w:tc>
+          <w:tcPr>
+            <w:tcW w:type="dxa" w:w="2880"/>
+            <w:shd w:val="clear" w:color="auto" w:fill="D6E4F0"/>
+          </w:tcPr>
+          <w:p>
+            <w:r>
+              <w:rPr>
+                <w:sz w:val="18"/>
+              </w:rPr>
+              <w:t>Produced and shared with Engineering</w:t>
+            </w:r>
+          </w:p>
+        </w:tc>
+      </w:tr>
+      <w:tr>
+        <w:tc>
+          <w:tcPr>
+            <w:tcW w:type="dxa" w:w="4032"/>
+            <w:shd w:val="clear" w:color="auto" w:fill="FFFFFF"/>
+          </w:tcPr>
+          <w:p>
+            <w:r>
+              <w:rPr>
+                <w:sz w:val="18"/>
+              </w:rPr>
+              <w:t>Monthly finance report</w:t>
+            </w:r>
+          </w:p>
+        </w:tc>
+        <w:tc>
+          <w:tcPr>
+            <w:tcW w:type="dxa" w:w="2592"/>
+            <w:shd w:val="clear" w:color="auto" w:fill="FFFFFF"/>
+          </w:tcPr>
+          <w:p>
+            <w:r>
+              <w:rPr>
+                <w:sz w:val="18"/>
+              </w:rPr>
+              <w:t>Finance Manager</w:t>
+            </w:r>
+          </w:p>
+        </w:tc>
+        <w:tc>
+          <w:tcPr>
+            <w:tcW w:type="dxa" w:w="2880"/>
+            <w:shd w:val="clear" w:color="auto" w:fill="FFFFFF"/>
+          </w:tcPr>
+          <w:p>
+            <w:r>
+              <w:rPr>
+                <w:sz w:val="18"/>
+              </w:rPr>
+              <w:t>Produced and presented — not distributed</w:t>
+            </w:r>
+          </w:p>
+        </w:tc>
+      </w:tr>
+      <w:tr>
+        <w:tc>
+          <w:tcPr>
+            <w:tcW w:type="dxa" w:w="4032"/>
+            <w:shd w:val="clear" w:color="auto" w:fill="D6E4F0"/>
+          </w:tcPr>
+          <w:p>
+            <w:r>
+              <w:rPr>
+                <w:sz w:val="18"/>
+              </w:rPr>
+              <w:t>System recommendation (job time)</w:t>
+            </w:r>
+          </w:p>
+        </w:tc>
+        <w:tc>
+          <w:tcPr>
+            <w:tcW w:type="dxa" w:w="2592"/>
+            <w:shd w:val="clear" w:color="auto" w:fill="D6E4F0"/>
+          </w:tcPr>
+          <w:p>
+            <w:r>
+              <w:rPr>
+                <w:sz w:val="18"/>
+              </w:rPr>
+              <w:t>Finance Manager</w:t>
+            </w:r>
+          </w:p>
+        </w:tc>
+        <w:tc>
+          <w:tcPr>
+            <w:tcW w:type="dxa" w:w="2880"/>
+            <w:shd w:val="clear" w:color="auto" w:fill="D6E4F0"/>
+          </w:tcPr>
+          <w:p>
+            <w:r>
+              <w:rPr>
+                <w:sz w:val="18"/>
+              </w:rPr>
+              <w:t>View delivered within 6 months</w:t>
             </w:r>
           </w:p>
         </w:tc>
@@ -3392,7 +4505,7 @@
           <w:color w:val="404040"/>
           <w:sz w:val="20"/>
         </w:rPr>
-        <w:t>Map the costing process this month — where does it wait?</w:t>
+        <w:t>Start sharing actual job hours with Engineering Manager monthly — that data improves their estimates</w:t>
       </w:r>
     </w:p>
     <w:p>
@@ -3405,7 +4518,7 @@
           <w:color w:val="404040"/>
           <w:sz w:val="20"/>
         </w:rPr>
-        <w:t>Define what you need from upstream to start costing immediately on receipt</w:t>
+        <w:t>Produce a job time variance report (actual vs estimated) — flag the outliers</w:t>
       </w:r>
     </w:p>
     <w:p>
@@ -3418,7 +4531,7 @@
           <w:color w:val="404040"/>
           <w:sz w:val="20"/>
         </w:rPr>
-        <w:t>Assess ERP/systems options and bring a recommendation within 6 months</w:t>
+        <w:t>Review AR timing: are invoices going out promptly when jobs close?</w:t>
       </w:r>
     </w:p>
     <w:p>
@@ -3431,7 +4544,20 @@
           <w:color w:val="404040"/>
           <w:sz w:val="20"/>
         </w:rPr>
-        <w:t>Start producing the financial BSC section — own it, don't just report it</w:t>
+        <w:t>Bring a view on job time monitoring systems within 6 months</w:t>
+      </w:r>
+    </w:p>
+    <w:p>
+      <w:pPr>
+        <w:pStyle w:val="ListNumber"/>
+        <w:spacing w:after="80"/>
+      </w:pPr>
+      <w:r>
+        <w:rPr>
+          <w:color w:val="404040"/>
+          <w:sz w:val="20"/>
+        </w:rPr>
+        <w:t>Own the monthly finance report — present it, don't just send it</w:t>
       </w:r>
     </w:p>
     <w:p>

</xml_diff>

<commit_message>
Update Managers Briefing: align decision rights with authority map
- CEO → MD throughout all decision rights tables
- Engineering Manager: escalation paths via Aviation GM and MD
- Operations Manager: job cost allocation, GK for systems scope
- Production: incomplete package ownership moved to Production Manager
- Safety: work stop and regulatory reporting escalate to MD
- Sales: customer relationship and pricing threshold → MD
- Aviation GM: all escalations → MD
- Procurement: supply chain, spend, supplier agreements → MD

Co-Authored-By: Claude Sonnet 4.6 <noreply@anthropic.com>
Claude-Session: https://claude.ai/code/session_01FujGE9vvBG8EQRodGbb5XZ
</commit_message>
<xml_diff>
--- a/Managers-Briefing-2026.docx
+++ b/Managers-Briefing-2026.docx
@@ -1941,7 +1941,7 @@
               <w:rPr>
                 <w:sz w:val="18"/>
               </w:rPr>
-              <w:t>Production GM</w:t>
+              <w:t>Production/ Aviation GM</w:t>
             </w:r>
           </w:p>
         </w:tc>
@@ -1955,7 +1955,7 @@
               <w:rPr>
                 <w:sz w:val="18"/>
               </w:rPr>
-              <w:t>CEO if cost impact significant</w:t>
+              <w:t>MD if cost or delivery impact significant</w:t>
             </w:r>
           </w:p>
         </w:tc>
@@ -2877,7 +2877,7 @@
               <w:rPr>
                 <w:sz w:val="18"/>
               </w:rPr>
-              <w:t>Job allocation decisions (within capacity)</w:t>
+              <w:t>Job cost allocation decisions (within capacity)</w:t>
             </w:r>
           </w:p>
         </w:tc>
@@ -2905,7 +2905,7 @@
               <w:rPr>
                 <w:sz w:val="18"/>
               </w:rPr>
-              <w:t>Production GM</w:t>
+              <w:t>Production GM/ Manager</w:t>
             </w:r>
           </w:p>
         </w:tc>
@@ -2977,7 +2977,7 @@
               <w:rPr>
                 <w:sz w:val="18"/>
               </w:rPr>
-              <w:t>CEO if unresolvable</w:t>
+              <w:t>GK if unresolvable</w:t>
             </w:r>
           </w:p>
         </w:tc>
@@ -3035,7 +3035,7 @@
               <w:rPr>
                 <w:sz w:val="18"/>
               </w:rPr>
-              <w:t>CEO (approval)</w:t>
+              <w:t>MD (approval)</w:t>
             </w:r>
           </w:p>
         </w:tc>
@@ -4005,7 +4005,7 @@
               <w:rPr>
                 <w:sz w:val="18"/>
               </w:rPr>
-              <w:t>CEO (approval)</w:t>
+              <w:t>MD (approval)</w:t>
             </w:r>
           </w:p>
         </w:tc>
@@ -4179,7 +4179,7 @@
               <w:rPr>
                 <w:sz w:val="18"/>
               </w:rPr>
-              <w:t>CEO if material</w:t>
+              <w:t>MD if material</w:t>
             </w:r>
           </w:p>
         </w:tc>
@@ -5005,7 +5005,7 @@
               <w:rPr>
                 <w:sz w:val="18"/>
               </w:rPr>
-              <w:t>Stopping a job — incomplete package</w:t>
+              <w:t>Incomplete engineering package — escalate</w:t>
             </w:r>
           </w:p>
         </w:tc>
@@ -5019,7 +5019,7 @@
               <w:rPr>
                 <w:sz w:val="18"/>
               </w:rPr>
-              <w:t>Production Supervisor</w:t>
+              <w:t>Production Manager</w:t>
             </w:r>
           </w:p>
         </w:tc>
@@ -5033,7 +5033,7 @@
               <w:rPr>
                 <w:sz w:val="18"/>
               </w:rPr>
-              <w:t>—</w:t>
+              <w:t>Production GM (mandatory)</w:t>
             </w:r>
           </w:p>
         </w:tc>
@@ -5047,7 +5047,7 @@
               <w:rPr>
                 <w:sz w:val="18"/>
               </w:rPr>
-              <w:t>Production Manager (inform immediately)</w:t>
+              <w:t>Engineering Manager same day</w:t>
             </w:r>
           </w:p>
         </w:tc>
@@ -5105,7 +5105,7 @@
               <w:rPr>
                 <w:sz w:val="18"/>
               </w:rPr>
-              <w:t>CEO if capital or headcount required</w:t>
+              <w:t>MD if capital or headcount required</w:t>
             </w:r>
           </w:p>
         </w:tc>
@@ -5149,7 +5149,7 @@
               <w:rPr>
                 <w:sz w:val="18"/>
               </w:rPr>
-              <w:t>Finance Manager</w:t>
+              <w:t>MD/ Finance Manager</w:t>
             </w:r>
           </w:p>
         </w:tc>
@@ -5163,7 +5163,7 @@
               <w:rPr>
                 <w:sz w:val="18"/>
               </w:rPr>
-              <w:t>CEO if significant cost impact</w:t>
+              <w:t>MD if significant cost impact</w:t>
             </w:r>
           </w:p>
         </w:tc>
@@ -6413,7 +6413,7 @@
               <w:rPr>
                 <w:sz w:val="18"/>
               </w:rPr>
-              <w:t>CEO — mandatory</w:t>
+              <w:t>MD/ Aviation GM — mandatory</w:t>
             </w:r>
           </w:p>
         </w:tc>
@@ -7160,7 +7160,7 @@
               <w:rPr>
                 <w:sz w:val="18"/>
               </w:rPr>
-              <w:t>CEO (inform immediately)</w:t>
+              <w:t>MD (inform immediately)</w:t>
             </w:r>
           </w:p>
         </w:tc>
@@ -7276,7 +7276,7 @@
               <w:rPr>
                 <w:sz w:val="18"/>
               </w:rPr>
-              <w:t>CEO if recordable</w:t>
+              <w:t>MD if recordable</w:t>
             </w:r>
           </w:p>
         </w:tc>
@@ -7334,7 +7334,7 @@
               <w:rPr>
                 <w:sz w:val="18"/>
               </w:rPr>
-              <w:t>CEO if investment required</w:t>
+              <w:t>MD if investment required</w:t>
             </w:r>
           </w:p>
         </w:tc>
@@ -7392,7 +7392,7 @@
               <w:rPr>
                 <w:sz w:val="18"/>
               </w:rPr>
-              <w:t>CEO — mandatory</w:t>
+              <w:t>MD — mandatory</w:t>
             </w:r>
           </w:p>
         </w:tc>
@@ -7713,7 +7713,7 @@
           <w:color w:val="404040"/>
           <w:sz w:val="20"/>
         </w:rPr>
-        <w:t>When you call a work stop for a safety reason — document it and inform the CEO same day</w:t>
+        <w:t>When you call a work stop for a safety reason — document it and inform the MD same day</w:t>
       </w:r>
     </w:p>
     <w:p>
@@ -8877,7 +8877,7 @@
               <w:rPr>
                 <w:sz w:val="18"/>
               </w:rPr>
-              <w:t>CEO if customer relationship at risk</w:t>
+              <w:t>MD if customer relationship at risk</w:t>
             </w:r>
           </w:p>
         </w:tc>
@@ -8935,7 +8935,7 @@
               <w:rPr>
                 <w:sz w:val="18"/>
               </w:rPr>
-              <w:t>CEO above defined threshold</w:t>
+              <w:t>MD above defined threshold</w:t>
             </w:r>
           </w:p>
         </w:tc>
@@ -9051,7 +9051,7 @@
               <w:rPr>
                 <w:sz w:val="18"/>
               </w:rPr>
-              <w:t>CEO if material margin impact</w:t>
+              <w:t>MD if material margin impact</w:t>
             </w:r>
           </w:p>
         </w:tc>
@@ -9473,7 +9473,7 @@
           <w:color w:val="1F3964"/>
           <w:sz w:val="20"/>
         </w:rPr>
-        <w:t>When an aviation defect reaches a customer — escalate to the CEO immediately. There is no version of that conversation that gets better by waiting.</w:t>
+        <w:t>When an aviation defect reaches a customer — escalate to the MD immediately. There is no version of that conversation that gets better by waiting.</w:t>
       </w:r>
     </w:p>
     <w:p>
@@ -9696,7 +9696,7 @@
               <w:rPr>
                 <w:sz w:val="18"/>
               </w:rPr>
-              <w:t>CEO if material contract</w:t>
+              <w:t>MD if material contract</w:t>
             </w:r>
           </w:p>
         </w:tc>
@@ -9754,7 +9754,7 @@
               <w:rPr>
                 <w:sz w:val="18"/>
               </w:rPr>
-              <w:t>CEO if regulatory impact</w:t>
+              <w:t>MD if regulatory impact</w:t>
             </w:r>
           </w:p>
         </w:tc>
@@ -9812,7 +9812,7 @@
               <w:rPr>
                 <w:sz w:val="18"/>
               </w:rPr>
-              <w:t>CEO — mandatory, same day</w:t>
+              <w:t>MD — mandatory, same day</w:t>
             </w:r>
           </w:p>
         </w:tc>
@@ -9870,7 +9870,7 @@
               <w:rPr>
                 <w:sz w:val="18"/>
               </w:rPr>
-              <w:t>CEO</w:t>
+              <w:t>MD</w:t>
             </w:r>
           </w:p>
         </w:tc>
@@ -10178,7 +10178,7 @@
           <w:color w:val="404040"/>
           <w:sz w:val="20"/>
         </w:rPr>
-        <w:t>When an aviation defect reaches a customer: escalate to the CEO the same day, every time</w:t>
+        <w:t>When an aviation defect reaches a customer: escalate to the MD the same day, every time</w:t>
       </w:r>
     </w:p>
     <w:p>
@@ -10277,7 +10277,7 @@
           <w:color w:val="404040"/>
           <w:sz w:val="20"/>
         </w:rPr>
-        <w:t>Procurement has a direct view of the upstream quality problem that no other function has: the cost of every BOM change, late release, and emergency order is visible here. That data is valuable to Engineering and to the CEO — and it is yours to surface.</w:t>
+        <w:t>Procurement has a direct view of the upstream quality problem that no other function has: the cost of every BOM change, late release, and emergency order is visible here. That data is valuable to Engineering and to the MD — and it is yours to surface.</w:t>
       </w:r>
     </w:p>
     <w:p>
@@ -10594,7 +10594,7 @@
               <w:rPr>
                 <w:sz w:val="18"/>
               </w:rPr>
-              <w:t>CEO if supply chain at risk</w:t>
+              <w:t>MD if supply chain at risk</w:t>
             </w:r>
           </w:p>
         </w:tc>
@@ -10652,7 +10652,7 @@
               <w:rPr>
                 <w:sz w:val="18"/>
               </w:rPr>
-              <w:t>CEO above defined threshold</w:t>
+              <w:t>MD above defined threshold</w:t>
             </w:r>
           </w:p>
         </w:tc>
@@ -10710,7 +10710,7 @@
               <w:rPr>
                 <w:sz w:val="18"/>
               </w:rPr>
-              <w:t>CEO (approval)</w:t>
+              <w:t>MD (approval)</w:t>
             </w:r>
           </w:p>
         </w:tc>

</xml_diff>

<commit_message>
Fix remaining CEO references → MD in Managers Briefing
Co-Authored-By: Claude Sonnet 4.6 <noreply@anthropic.com>
Claude-Session: https://claude.ai/code/session_01FujGE9vvBG8EQRodGbb5XZ
</commit_message>
<xml_diff>
--- a/Managers-Briefing-2026.docx
+++ b/Managers-Briefing-2026.docx
@@ -475,7 +475,7 @@
           <w:color w:val="404040"/>
           <w:sz w:val="20"/>
         </w:rPr>
-        <w:t>The business has grown to a point where the CEO cannot be — and should not be — the answer to everything. Scalable businesses have leaders who own their domains.</w:t>
+        <w:t>The business has grown to a point where the MD cannot be — and should not be — the answer to everything. Scalable businesses have leaders who own their domains.</w:t>
       </w:r>
     </w:p>
     <w:p>
@@ -2595,7 +2595,7 @@
           <w:color w:val="404040"/>
           <w:sz w:val="20"/>
         </w:rPr>
-        <w:t>At current volume, manual costing processes may be at their limit. Assess whether a job costing or ERP system would materially improve turnaround speed and accuracy. Bring a recommendation to the CEO within 6 months — not a shortlist, a recommendation with a preferred option and rationale.</w:t>
+        <w:t>At current volume, manual costing processes may be at their limit. Assess whether a job costing or ERP system would materially improve turnaround speed and accuracy. Bring a recommendation to the MD within 6 months — not a shortlist, a recommendation with a preferred option and rationale.</w:t>
       </w:r>
     </w:p>
     <w:p>

</xml_diff>